<commit_message>
LAB7: thêm link video YouTube (https://youtu.be/opThPopNHfc)
</commit_message>
<xml_diff>
--- a/LAB7/11CNPM2-Lab7_1150080120-HoangThanhTra_HoanChinh.docx
+++ b/LAB7/11CNPM2-Lab7_1150080120-HoangThanhTra_HoanChinh.docx
@@ -172,9 +172,48 @@
           <w:rFonts w:hint="default" w:ascii="Times New Roman" w:hAnsi="Times New Roman" w:cs="Times New Roman"/>
           <w:b w:val="0"/>
           <w:i w:val="0"/>
-          <w:highlight w:val="yellow"/>
-        </w:rPr>
-        <w:t>Link video: [cập nhật link YouTube sau khi upload] – video hoàn chỉnh LAB7_Web_Protection_1150080120_HoangThanhTra.mp4</w:t>
+        </w:rPr>
+        <w:t xml:space="preserve">Link video: </w:t>
+      </w:r>
+      <w:r>
+        <w:rPr>
+          <w:rFonts w:hint="default" w:ascii="Times New Roman" w:hAnsi="Times New Roman" w:cs="Times New Roman"/>
+          <w:color w:val="0563C1"/>
+          <w:u w:val="single"/>
+        </w:rPr>
+        <w:fldChar w:fldCharType="begin"/>
+      </w:r>
+      <w:r>
+        <w:rPr>
+          <w:rFonts w:hint="default" w:ascii="Times New Roman" w:hAnsi="Times New Roman" w:cs="Times New Roman"/>
+          <w:color w:val="0563C1"/>
+          <w:u w:val="single"/>
+        </w:rPr>
+        <w:instrText xml:space="preserve"> HYPERLINK "https://youtu.be/opThPopNHfc" </w:instrText>
+      </w:r>
+      <w:r>
+        <w:rPr>
+          <w:rFonts w:hint="default" w:ascii="Times New Roman" w:hAnsi="Times New Roman" w:cs="Times New Roman"/>
+          <w:color w:val="0563C1"/>
+          <w:u w:val="single"/>
+        </w:rPr>
+        <w:fldChar w:fldCharType="separate"/>
+      </w:r>
+      <w:r>
+        <w:rPr>
+          <w:rFonts w:hint="default" w:ascii="Times New Roman" w:hAnsi="Times New Roman" w:cs="Times New Roman"/>
+          <w:color w:val="0563C1"/>
+          <w:u w:val="single"/>
+        </w:rPr>
+        <w:t>https://youtu.be/opThPopNHfc</w:t>
+      </w:r>
+      <w:r>
+        <w:rPr>
+          <w:rFonts w:hint="default" w:ascii="Times New Roman" w:hAnsi="Times New Roman" w:cs="Times New Roman"/>
+          <w:color w:val="0563C1"/>
+          <w:u w:val="single"/>
+        </w:rPr>
+        <w:fldChar w:fldCharType="end"/>
       </w:r>
     </w:p>
     <w:p>

</xml_diff>